<commit_message>
docs(qa): update ProjectFlows/TestExecutionGuide/SRS/Report5 to match current code, fix stale RGA-SUB-1 and RAG010-ST-6 test assertions
Sync ProjectFlows.docx and the SRS with the current HR generate flow (Studio-only, /hr/generate-question), gamification, and admin marketplace; write SRS §3.4 System Administrator from scratch with real admin-account screenshots; rewrite TestExecutionGuide.docx for Vitest.

RGA-SUB-1 and RAG010-ST-6 asserted behavior that no longer matches the app's intentional design (dialog instead of toast for quota errors; restored runs don't reopen the dialog) — updated to match.
</commit_message>
<xml_diff>
--- a/docs/qa/ProjectFlows.docx
+++ b/docs/qa/ProjectFlows.docx
@@ -625,7 +625,7 @@
           <w:sz w:val="20"/>
           <w:szCs w:val="20"/>
         </w:rPr>
-        <w:t xml:space="preserve">src/app/hr/generate/manual</w:t>
+        <w:t xml:space="preserve">src/app/hr/generate-question/manual (src/app/hr/generate/manual chỉ còn là trang redirect sang route này)</w:t>
       </w:r>
     </w:p>
     <w:p>
@@ -645,7 +645,7 @@
           <w:sz w:val="20"/>
           <w:szCs w:val="20"/>
         </w:rPr>
-        <w:t xml:space="preserve">src/features/question/services/question.service.ts</w:t>
+        <w:t xml:space="preserve">src/features/interview/services/interview.service.ts (createManualDraftQuestionSet) + src/features/hr/services/hr-history.service.ts</w:t>
       </w:r>
     </w:p>
     <w:p>
@@ -669,7 +669,7 @@
         <w:jc w:val="both"/>
       </w:pPr>
       <w:r>
-        <w:t xml:space="preserve">HR tự nhập từng câu hỏi, chọn loại (kỹ thuật/hành vi...), lưu thành 1 question set như các set được tạo bằng AI.</w:t>
+        <w:t xml:space="preserve">HR tự nhập từng câu hỏi, chọn loại (kỹ thuật/hành vi...), lưu thành 1 question set như các set được tạo bằng AI. Component chính là QuestionBuilderPage (src/features/interview/components/generate/question-builder-page.tsx) — không còn dùng question.service.ts như bản trước; file đó giờ chỉ phục vụ panel “Ask AI” riêng, không liên quan tới việc tạo câu hỏi.</w:t>
       </w:r>
     </w:p>
     <w:p>
@@ -685,7 +685,7 @@
           <w:sz w:val="24"/>
           <w:szCs w:val="24"/>
         </w:rPr>
-        <w:t xml:space="preserve">Quick Generate — tạo câu hỏi nhanh bằng AI, 1 bước</w:t>
+        <w:t xml:space="preserve">Quick Generate (v1) — đã ngừng dùng, chỉ còn trang redirect</w:t>
       </w:r>
     </w:p>
     <w:p>
@@ -705,7 +705,52 @@
           <w:sz w:val="20"/>
           <w:szCs w:val="20"/>
         </w:rPr>
-        <w:t xml:space="preserve">src/app/hr/generate</w:t>
+        <w:t xml:space="preserve">src/app/hr/generate (chỉ còn 1 trang redirect tự động router.replace sang /hr/generate-question, không còn UI/luồng “1 bước” riêng)</w:t>
+      </w:r>
+    </w:p>
+    <w:p>
+      <w:pPr>
+        <w:spacing w:after="140"/>
+        <w:jc w:val="both"/>
+      </w:pPr>
+      <w:r>
+        <w:t xml:space="preserve">Flow “tạo câu hỏi nhanh bằng AI trong 1 bước” (nhập JD -&gt; tạo plan -&gt; generate ngay, gọi qua interview.service.ts + rag.service.ts) đã bị retire hoàn toàn khỏi UI — rag.service.ts gần như không còn nơi nào gọi tới ngoài re-export. Toàn bộ việc tạo câu hỏi bằng AI hiện đi qua Studio bên dưới.</w:t>
+      </w:r>
+    </w:p>
+    <w:p>
+      <w:pPr>
+        <w:spacing w:after="60" w:before="160"/>
+      </w:pPr>
+      <w:r>
+        <w:rPr>
+          <w:b/>
+          <w:bCs/>
+          <w:i/>
+          <w:iCs/>
+          <w:sz w:val="24"/>
+          <w:szCs w:val="24"/>
+        </w:rPr>
+        <w:t xml:space="preserve">Studio — tạo câu hỏi có hội thoại làm rõ yêu cầu</w:t>
+      </w:r>
+    </w:p>
+    <w:p>
+      <w:pPr>
+        <w:spacing w:after="40"/>
+      </w:pPr>
+      <w:r>
+        <w:rPr>
+          <w:b/>
+          <w:bCs/>
+        </w:rPr>
+        <w:t xml:space="preserve">Route: </w:t>
+      </w:r>
+      <w:r>
+        <w:rPr>
+          <w:rFonts w:ascii="Consolas" w:cs="Consolas" w:eastAsia="Consolas" w:hAnsi="Consolas"/>
+          <w:sz w:val="20"/>
+          <w:szCs w:val="20"/>
+        </w:rPr>
+        <w:t xml:space="preserve">src/app/hr/generate-question (đường dẫn cũ src/app/hr/generate-v2 đã ngừng dùng — thư mục đó giờ chỉ còn file .backup, không có page.tsx sống, vào sẽ 404)</w:t>
       </w:r>
     </w:p>
     <w:p>
@@ -725,7 +770,7 @@
           <w:sz w:val="20"/>
           <w:szCs w:val="20"/>
         </w:rPr>
-        <w:t xml:space="preserve">src/features/interview/services/interview.service.ts, rag.service.ts</w:t>
+        <w:t xml:space="preserve">src/features/studio/services/studio.service.ts, hook use-studio.ts</w:t>
       </w:r>
     </w:p>
     <w:p>
@@ -745,86 +790,6 @@
           <w:sz w:val="20"/>
           <w:szCs w:val="20"/>
         </w:rPr>
-        <w:t xml:space="preserve">POST /api/rag/interview-plans/start (BFF) -&gt; RAG_IQGS -&gt; generate câu hỏi -&gt; reorder/publish</w:t>
-      </w:r>
-    </w:p>
-    <w:p>
-      <w:pPr>
-        <w:spacing w:after="140"/>
-        <w:jc w:val="both"/>
-      </w:pPr>
-      <w:r>
-        <w:t xml:space="preserve">HR nhập JD và số lượng câu hỏi mong muốn. Hệ thống tạo 1 "plan" (vai trò, kỹ năng, cấu trúc câu hỏi) rồi tự generate câu hỏi từ plan đó, hiển thị để HR duyệt/sửa/sắp xếp lại thứ tự trước khi publish. Nếu bước tạo plan hoặc generate fail thì có nút Retry Plan gọi lại endpoint retry-plan; nếu lỗi thuộc dạng cần sửa input thì cho sửa JD ngay tại chỗ và gửi lại.</w:t>
-      </w:r>
-    </w:p>
-    <w:p>
-      <w:pPr>
-        <w:spacing w:after="60" w:before="160"/>
-      </w:pPr>
-      <w:r>
-        <w:rPr>
-          <w:b/>
-          <w:bCs/>
-          <w:i/>
-          <w:iCs/>
-          <w:sz w:val="24"/>
-          <w:szCs w:val="24"/>
-        </w:rPr>
-        <w:t xml:space="preserve">Studio (generate-v2) — tạo câu hỏi có hội thoại làm rõ yêu cầu</w:t>
-      </w:r>
-    </w:p>
-    <w:p>
-      <w:pPr>
-        <w:spacing w:after="40"/>
-      </w:pPr>
-      <w:r>
-        <w:rPr>
-          <w:b/>
-          <w:bCs/>
-        </w:rPr>
-        <w:t xml:space="preserve">Route: </w:t>
-      </w:r>
-      <w:r>
-        <w:rPr>
-          <w:rFonts w:ascii="Consolas" w:cs="Consolas" w:eastAsia="Consolas" w:hAnsi="Consolas"/>
-          <w:sz w:val="20"/>
-          <w:szCs w:val="20"/>
-        </w:rPr>
-        <w:t xml:space="preserve">src/app/hr/generate-v2</w:t>
-      </w:r>
-    </w:p>
-    <w:p>
-      <w:pPr>
-        <w:spacing w:after="40"/>
-      </w:pPr>
-      <w:r>
-        <w:rPr>
-          <w:b/>
-          <w:bCs/>
-        </w:rPr>
-        <w:t xml:space="preserve">Service: </w:t>
-      </w:r>
-      <w:r>
-        <w:rPr>
-          <w:rFonts w:ascii="Consolas" w:cs="Consolas" w:eastAsia="Consolas" w:hAnsi="Consolas"/>
-          <w:sz w:val="20"/>
-          <w:szCs w:val="20"/>
-        </w:rPr>
-        <w:t xml:space="preserve">src/features/studio/services/studio.service.ts, hook use-studio.ts</w:t>
-      </w:r>
-    </w:p>
-    <w:p>
-      <w:pPr>
-        <w:spacing w:after="40"/>
-      </w:pPr>
-      <w:r>
-        <w:rPr>
-          <w:b/>
-          <w:bCs/>
-        </w:rPr>
-        <w:t xml:space="preserve">API: </w:t>
-      </w:r>
-      <w:r>
         <w:t xml:space="preserve">Chuỗi API: chat plan -&gt; plan review -&gt; approve -&gt; generate câu hỏi</w:t>
       </w:r>
     </w:p>
@@ -834,7 +799,7 @@
         <w:jc w:val="both"/>
       </w:pPr>
       <w:r>
-        <w:t xml:space="preserve">Khác Quick Generate ở bước chat làm rõ yêu cầu trước khi chốt plan: HR nhập JD, hệ thống có thể hỏi lại (tối đa 5 lượt hội thoại), khi đủ thông tin thì đề xuất 1 plan để HR xem lại/chỉnh sửa, bấm Approve Plan rồi generate câu hỏi. HR có thể upload tài liệu mới hoặc gắn tài liệu có sẵn từ thư viện kiến thức, hoặc dùng 1 JD mẫu dựng sẵn (Sample JD) để test nhanh. Vì bước generate có thể chạy nền, HR có thể tạo phiên mới trong lúc phiên cũ còn đang chạy nền (background job), quay lại xem sau kể cả sau khi tải lại trang.</w:t>
+        <w:t xml:space="preserve">HR nhập JD, hệ thống có thể hỏi lại để làm rõ yêu cầu (tối đa 5 lượt hội thoại), khi đủ thông tin thì đề xuất 1 plan để HR xem lại/chỉnh sửa, bấm Approve Plan rồi generate câu hỏi. HR có thể upload tài liệu mới hoặc gắn tài liệu có sẵn từ thư viện kiến thức, hoặc dùng 1 JD mẫu dựng sẵn (Sample JD) để test nhanh. Vì bước generate có thể chạy nền, HR có thể tạo phiên mới trong lúc phiên cũ còn đang chạy nền (background job), quay lại xem sau kể cả sau khi tải lại trang. Đây hiện là con đường duy nhất để tạo câu hỏi bằng AI trong dự án.</w:t>
       </w:r>
     </w:p>
     <w:p>
@@ -899,7 +864,7 @@
           <w:sz w:val="20"/>
           <w:szCs w:val="20"/>
         </w:rPr>
-        <w:t xml:space="preserve">src/features/interview/services/interview.service.ts (publish/unpublish, rename, reorder câu hỏi, bookmark)</w:t>
+        <w:t xml:space="preserve">src/features/interview/services/interview.service.ts (publish/unpublish, rename, reorder câu hỏi, bookmark) + src/features/hr/services/hr-history.service.ts (dữ liệu bảng History)</w:t>
       </w:r>
     </w:p>
     <w:p>
@@ -1009,6 +974,91 @@
       </w:pPr>
       <w:r>
         <w:t xml:space="preserve">HR xem danh sách ứng viên đã làm bài của 1 set cụ thể kèm điểm số, có thể publish/unpublish ngay tại đây.</w:t>
+      </w:r>
+    </w:p>
+    <w:p>
+      <w:pPr>
+        <w:spacing w:after="60" w:before="160"/>
+      </w:pPr>
+      <w:r>
+        <w:rPr>
+          <w:b/>
+          <w:bCs/>
+          <w:i/>
+          <w:iCs/>
+          <w:sz w:val="24"/>
+          <w:szCs w:val="24"/>
+        </w:rPr>
+        <w:t xml:space="preserve">Xem hồ sơ tổng quan 1 ứng viên (candidate overview)</w:t>
+      </w:r>
+    </w:p>
+    <w:p>
+      <w:pPr>
+        <w:spacing w:after="40"/>
+      </w:pPr>
+      <w:r>
+        <w:rPr>
+          <w:b/>
+          <w:bCs/>
+        </w:rPr>
+        <w:t xml:space="preserve">Route: </w:t>
+      </w:r>
+      <w:r>
+        <w:rPr>
+          <w:rFonts w:ascii="Consolas" w:cs="Consolas" w:eastAsia="Consolas" w:hAnsi="Consolas"/>
+          <w:sz w:val="20"/>
+          <w:szCs w:val="20"/>
+        </w:rPr>
+        <w:t xml:space="preserve">src/app/hr/candidates/[id]</w:t>
+      </w:r>
+    </w:p>
+    <w:p>
+      <w:pPr>
+        <w:spacing w:after="40"/>
+      </w:pPr>
+      <w:r>
+        <w:rPr>
+          <w:b/>
+          <w:bCs/>
+        </w:rPr>
+        <w:t xml:space="preserve">Service: </w:t>
+      </w:r>
+      <w:r>
+        <w:rPr>
+          <w:rFonts w:ascii="Consolas" w:cs="Consolas" w:eastAsia="Consolas" w:hAnsi="Consolas"/>
+          <w:sz w:val="20"/>
+          <w:szCs w:val="20"/>
+        </w:rPr>
+        <w:t xml:space="preserve">src/features/hr/services/hr-candidate.service.ts (getHrCandidateOverview)</w:t>
+      </w:r>
+    </w:p>
+    <w:p>
+      <w:pPr>
+        <w:spacing w:after="40"/>
+      </w:pPr>
+      <w:r>
+        <w:rPr>
+          <w:b/>
+          <w:bCs/>
+        </w:rPr>
+        <w:t xml:space="preserve">API: </w:t>
+      </w:r>
+      <w:r>
+        <w:rPr>
+          <w:rFonts w:ascii="Consolas" w:cs="Consolas" w:eastAsia="Consolas" w:hAnsi="Consolas"/>
+          <w:sz w:val="20"/>
+          <w:szCs w:val="20"/>
+        </w:rPr>
+        <w:t xml:space="preserve">GET /api/hr/candidates/{id}/overview</w:t>
+      </w:r>
+    </w:p>
+    <w:p>
+      <w:pPr>
+        <w:spacing w:after="140"/>
+        <w:jc w:val="both"/>
+      </w:pPr>
+      <w:r>
+        <w:t xml:space="preserve">Trang tổng hợp toàn bộ hồ sơ 1 ứng viên nhìn từ phía HR — thông tin cá nhân (bio, tech stack, LinkedIn/GitHub), thống kê luyện tập (tổng số phiên, điểm trung bình/cao nhất), chuỗi ngày hoạt động liên tiếp kèm heatmap, các achievement đã đạt, và lịch sử làm bài riêng trên các question set của chính HR này. Khác trang practitioners ở mục trên — practitioners liệt kê nhiều ứng viên theo 1 set, còn trang này đào sâu vào 1 ứng viên duy nhất trên toàn bộ set của HR đó.</w:t>
       </w:r>
     </w:p>
     <w:p>
@@ -2021,6 +2071,86 @@
     </w:p>
     <w:p>
       <w:pPr>
+        <w:spacing w:after="60" w:before="160"/>
+      </w:pPr>
+      <w:r>
+        <w:rPr>
+          <w:b/>
+          <w:bCs/>
+          <w:i/>
+          <w:iCs/>
+          <w:sz w:val="24"/>
+          <w:szCs w:val="24"/>
+        </w:rPr>
+        <w:t xml:space="preserve">Gamification — XP, streak, achievement, mục tiêu hằng ngày (mock, chưa có backend)</w:t>
+      </w:r>
+    </w:p>
+    <w:p>
+      <w:pPr>
+        <w:spacing w:after="40"/>
+      </w:pPr>
+      <w:r>
+        <w:rPr>
+          <w:b/>
+          <w:bCs/>
+        </w:rPr>
+        <w:t xml:space="preserve">Route: </w:t>
+      </w:r>
+      <w:r>
+        <w:t xml:space="preserve">Không có route riêng — nhúng vào các trang có sẵn: src/app/jobseeker/profile (thẻ tiến trình XP/level/streak), src/app/jobseeker/settings (chọn mục tiêu XP mỗi ngày + bật/tắt âm thanh), src/app/jobseeker/practice/[id]/result (thông báo XP nhận được sau khi làm bài)</w:t>
+      </w:r>
+    </w:p>
+    <w:p>
+      <w:pPr>
+        <w:spacing w:after="40"/>
+      </w:pPr>
+      <w:r>
+        <w:rPr>
+          <w:b/>
+          <w:bCs/>
+        </w:rPr>
+        <w:t xml:space="preserve">Service: </w:t>
+      </w:r>
+      <w:r>
+        <w:rPr>
+          <w:rFonts w:ascii="Consolas" w:cs="Consolas" w:eastAsia="Consolas" w:hAnsi="Consolas"/>
+          <w:sz w:val="20"/>
+          <w:szCs w:val="20"/>
+        </w:rPr>
+        <w:t xml:space="preserve">src/features/gamification/api/gamification-api.ts</w:t>
+      </w:r>
+    </w:p>
+    <w:p>
+      <w:pPr>
+        <w:spacing w:after="40"/>
+      </w:pPr>
+      <w:r>
+        <w:rPr>
+          <w:b/>
+          <w:bCs/>
+        </w:rPr>
+        <w:t xml:space="preserve">API: </w:t>
+      </w:r>
+      <w:r>
+        <w:rPr>
+          <w:rFonts w:ascii="Consolas" w:cs="Consolas" w:eastAsia="Consolas" w:hAnsi="Consolas"/>
+          <w:sz w:val="20"/>
+          <w:szCs w:val="20"/>
+        </w:rPr>
+        <w:t xml:space="preserve">Chưa có — mọi hàm (getMyProgress, getDailyActivity, getAchievements, updateDailyGoal, getXpHistory) đang trả dữ liệu mock cứng, lệnh gọi apiClient thật bị comment lại kèm TODO (backend). Endpoint dự kiến: GET /api/candidate/gamification/progress, .../daily-activity, .../achievements, PATCH .../daily-goal, GET .../xp-history.</w:t>
+      </w:r>
+    </w:p>
+    <w:p>
+      <w:pPr>
+        <w:spacing w:after="140"/>
+        <w:jc w:val="both"/>
+      </w:pPr>
+      <w:r>
+        <w:t xml:space="preserve">Hệ thống XP/level/streak/achievement/mục tiêu hằng ngày hoàn toàn ở phía FE, chưa lưu trữ ở backend — cộng XP mock sau mỗi phiên luyện tập, theo dõi streak và các achievement định nghĩa sẵn, cho phép đặt mục tiêu XP mỗi ngày và bật/tắt hiệu ứng âm thanh. Vì chưa nối API thật nên dữ liệu KHÔNG đồng bộ giữa các thiết bị/phiên đăng nhập khác nhau — cần lưu ý khi demo hoặc viết test, đừng nhầm là bug đồng bộ dữ liệu thật.</w:t>
+      </w:r>
+    </w:p>
+    <w:p>
+      <w:pPr>
         <w:pStyle w:val="Heading1"/>
         <w:spacing w:after="150" w:before="320"/>
       </w:pPr>
@@ -2536,6 +2666,91 @@
       </w:pPr>
       <w:r>
         <w:t xml:space="preserve">Khác tài liệu kiến thức của riêng từng HR (mục 4) — đây là tài liệu dùng chung cho toàn hệ thống, áp dụng cho việc sinh câu hỏi ở mọi công ty. Cùng dùng chung 1 component UI với trang HR, chỉ khác tham số nguồn dữ liệu.</w:t>
+      </w:r>
+    </w:p>
+    <w:p>
+      <w:pPr>
+        <w:spacing w:after="60" w:before="160"/>
+      </w:pPr>
+      <w:r>
+        <w:rPr>
+          <w:b/>
+          <w:bCs/>
+          <w:i/>
+          <w:iCs/>
+          <w:sz w:val="24"/>
+          <w:szCs w:val="24"/>
+        </w:rPr>
+        <w:t xml:space="preserve">Marketplace — duyệt &amp; ghim question set nổi bật toàn hệ thống</w:t>
+      </w:r>
+    </w:p>
+    <w:p>
+      <w:pPr>
+        <w:spacing w:after="40"/>
+      </w:pPr>
+      <w:r>
+        <w:rPr>
+          <w:b/>
+          <w:bCs/>
+        </w:rPr>
+        <w:t xml:space="preserve">Route: </w:t>
+      </w:r>
+      <w:r>
+        <w:rPr>
+          <w:rFonts w:ascii="Consolas" w:cs="Consolas" w:eastAsia="Consolas" w:hAnsi="Consolas"/>
+          <w:sz w:val="20"/>
+          <w:szCs w:val="20"/>
+        </w:rPr>
+        <w:t xml:space="preserve">src/app/admin/marketplace</w:t>
+      </w:r>
+    </w:p>
+    <w:p>
+      <w:pPr>
+        <w:spacing w:after="40"/>
+      </w:pPr>
+      <w:r>
+        <w:rPr>
+          <w:b/>
+          <w:bCs/>
+        </w:rPr>
+        <w:t xml:space="preserve">Service: </w:t>
+      </w:r>
+      <w:r>
+        <w:rPr>
+          <w:rFonts w:ascii="Consolas" w:cs="Consolas" w:eastAsia="Consolas" w:hAnsi="Consolas"/>
+          <w:sz w:val="20"/>
+          <w:szCs w:val="20"/>
+        </w:rPr>
+        <w:t xml:space="preserve">src/features/admin/services/admin-marketplace.service.ts</w:t>
+      </w:r>
+    </w:p>
+    <w:p>
+      <w:pPr>
+        <w:spacing w:after="40"/>
+      </w:pPr>
+      <w:r>
+        <w:rPr>
+          <w:b/>
+          <w:bCs/>
+        </w:rPr>
+        <w:t xml:space="preserve">API: </w:t>
+      </w:r>
+      <w:r>
+        <w:rPr>
+          <w:rFonts w:ascii="Consolas" w:cs="Consolas" w:eastAsia="Consolas" w:hAnsi="Consolas"/>
+          <w:sz w:val="20"/>
+          <w:szCs w:val="20"/>
+        </w:rPr>
+        <w:t xml:space="preserve">GET /api/admin/marketplace/stats, GET .../question-sets, GET .../question-sets/{id}, POST/DELETE .../question-sets/{id}/pin</w:t>
+      </w:r>
+    </w:p>
+    <w:p>
+      <w:pPr>
+        <w:spacing w:after="140"/>
+        <w:jc w:val="both"/>
+      </w:pPr>
+      <w:r>
+        <w:t xml:space="preserve">Admin duyệt toàn bộ question set đã publish trên hệ thống (không giới hạn theo công ty), lọc/sắp xếp theo featured/mới nhất/luyện tập nhiều nhất/đánh giá cao nhất, xem thống kê tổng quan, mở chi tiết 1 set (câu hỏi + danh sách ứng viên đã làm), và ghim/gỡ ghim để đưa 1 set lên nổi bật trong marketplace. Đây là trang admin mới, gọi API thật hoàn toàn — không dùng dữ liệu mẫu.</w:t>
       </w:r>
     </w:p>
     <w:p>
@@ -2856,7 +3071,7 @@
         <w:jc w:val="both"/>
       </w:pPr>
       <w:r>
-        <w:t xml:space="preserve">start_plan() yêu cầu đã có ít nhất 1 tài liệu JD được ingest sẵn cho owner_id đó, chưa có thì báo lỗi ngay chứ không gọi LLM. continue_plan() đếm số lượt hỏi-đáp trước khi gọi LLM — vượt quá 5 lượt (MAX_PLAN_TURNS) thì chặn lại ngay, không tốn thêm lệnh gọi LLM. confirm_plan() kiểm tra cấu trúc plan hợp lệ trước khi gọi LLM để sinh câu tóm tắt; nếu bước tóm tắt này lỗi thì bị nuốt lặng lẽ, không làm hỏng cả request vì đây chỉ là phần làm đẹp kết quả. Lỗi thật sự từ việc gọi LLM (model lỗi, không phản hồi) trả về mã lỗi và HTTP 502, khác với lỗi cấu trúc plan (HTTP 422).</w:t>
+        <w:t xml:space="preserve">start_plan() yêu cầu đã có ít nhất 1 tài liệu JD được ingest sẵn cho owner_id đó, chưa có thì báo lỗi ngay chứ không gọi LLM. continue_plan() đếm số lượt hỏi-đáp trước khi gọi LLM — vượt quá số lượt tối đa (MAX_PLAN_TURNS, mặc định 5, cấu hình được qua biến môi trường trong config.py) thì chặn lại ngay, không tốn thêm lệnh gọi LLM. confirm_plan() kiểm tra cấu trúc plan hợp lệ trước khi gọi LLM để sinh câu tóm tắt; nếu bước tóm tắt này lỗi thì bị nuốt lặng lẽ, không làm hỏng cả request vì đây chỉ là phần làm đẹp kết quả. Lỗi thật sự từ việc gọi LLM (model lỗi, không phản hồi) trả về mã lỗi và HTTP 502, khác với lỗi cấu trúc plan (HTTP 422).</w:t>
       </w:r>
     </w:p>
     <w:sectPr>

</xml_diff>

<commit_message>
docs(qa): add presentation script section to ProjectFlows
</commit_message>
<xml_diff>
--- a/docs/qa/ProjectFlows.docx
+++ b/docs/qa/ProjectFlows.docx
@@ -57,6 +57,304 @@
       </w:pPr>
       <w:r>
         <w:t xml:space="preserve">Một vài trang ở khu vực Admin hiện chưa nối vào API thật mà đang dùng dữ liệu tĩnh (mock) để demo UI — các trang này được ghi chú rõ trong phần tương ứng và tổng hợp lại ở bảng cuối tài liệu, để không ai nhầm tưởng đó là dữ liệu thật khi đọc code.</w:t>
+      </w:r>
+    </w:p>
+    <w:p>
+      <w:pPr>
+        <w:pStyle w:val="Heading1"/>
+        <w:spacing w:after="150" w:before="320"/>
+      </w:pPr>
+      <w:r>
+        <w:t xml:space="preserve">KỊCH BẢN THUYẾT TRÌNH — CÁC LUỒNG NGHIỆP VỤ CHÍNH</w:t>
+      </w:r>
+    </w:p>
+    <w:p>
+      <w:pPr>
+        <w:spacing w:after="140"/>
+        <w:jc w:val="both"/>
+      </w:pPr>
+      <w:r>
+        <w:rPr>
+          <w:i/>
+          <w:iCs/>
+        </w:rPr>
+        <w:t xml:space="preserve">Phần này viết lại 6 luồng quan trọng nhất của hệ thống bằng văn nói tự nhiên, theo đúng thứ tự để trình bày và học thuộc — không dùng ký hiệu kỹ thuật (Route/Service/API). Phần tra cứu kỹ thuật chi tiết theo từng route/service/API vẫn giữ nguyên phía sau, dùng khi cần debug hoặc trả lời câu hỏi phản biện sâu.</w:t>
+      </w:r>
+    </w:p>
+    <w:p>
+      <w:pPr>
+        <w:spacing w:after="140"/>
+        <w:jc w:val="both"/>
+      </w:pPr>
+      <w:r>
+        <w:t xml:space="preserve">Gợi ý cấu trúc khi trình bày: 1 câu mở đầu giới thiệu hệ thống và 3 vai trò người dùng (HR, Candidate, Admin) → đi lần lượt 6 luồng theo đúng hành trình sử dụng thực tế → 1 đoạn kết nhấn lại 3 điểm mạnh kỹ thuật. Mỗi luồng có 1 đoạn “Điểm nhấn” tô nền — đây là câu nên nhớ kỹ nhất nếu quên chi tiết, vì nó trả lời đúng câu hỏi “cái này có gì hay/khác biệt”.</w:t>
+      </w:r>
+    </w:p>
+    <w:p>
+      <w:pPr>
+        <w:pBdr>
+          <w:bottom w:val="single" w:sz="6" w:space="1" w:color="C9C9C9"/>
+        </w:pBdr>
+        <w:spacing w:after="220"/>
+      </w:pPr>
+    </w:p>
+    <w:p>
+      <w:pPr>
+        <w:spacing w:after="60" w:before="220"/>
+      </w:pPr>
+      <w:r>
+        <w:rPr>
+          <w:b/>
+          <w:bCs/>
+          <w:i/>
+          <w:iCs/>
+          <w:sz w:val="26"/>
+          <w:szCs w:val="26"/>
+        </w:rPr>
+        <w:t xml:space="preserve">Mở đầu — Giới thiệu hệ thống</w:t>
+      </w:r>
+    </w:p>
+    <w:p>
+      <w:pPr>
+        <w:spacing w:after="140"/>
+        <w:jc w:val="both"/>
+      </w:pPr>
+      <w:r>
+        <w:t xml:space="preserve">HireGen AI là nền tảng tạo câu hỏi phỏng vấn kỹ thuật bằng AI, sử dụng RAG (Retrieval-Augmented Generation) để câu hỏi bám sát mô tả công việc thật và tài liệu chuyên môn riêng của từng công ty, thay vì chỉ dựa vào một prompt chung chung. Hệ thống phục vụ 3 nhóm người dùng: HR — người tạo câu hỏi và tuyển dụng; Candidate — ứng viên luyện tập và được AI đánh giá; Admin — người quản trị toàn bộ nền tảng.</w:t>
+      </w:r>
+    </w:p>
+    <w:p>
+      <w:pPr>
+        <w:spacing w:after="60" w:before="220"/>
+      </w:pPr>
+      <w:r>
+        <w:rPr>
+          <w:b/>
+          <w:bCs/>
+          <w:i/>
+          <w:iCs/>
+          <w:sz w:val="26"/>
+          <w:szCs w:val="26"/>
+        </w:rPr>
+        <w:t xml:space="preserve">Luồng 1 — Đăng ký &amp; Đăng nhập</w:t>
+      </w:r>
+    </w:p>
+    <w:p>
+      <w:pPr>
+        <w:spacing w:after="140"/>
+        <w:jc w:val="both"/>
+      </w:pPr>
+      <w:r>
+        <w:t xml:space="preserve">Người dùng đăng ký theo vai trò — HR cần điền thêm tên công ty, Candidate thì không. Sau khi đăng ký, hệ thống gửi email chứa mã OTP 6 số; tài khoản chỉ được kích hoạt sau khi xác thực OTP thành công. Khi đăng nhập, hệ thống cấp access token và refresh token; access token hết hạn sẽ được tự động làm mới ở phía nền — người dùng không hề bị gián đoạn, trừ khi việc làm mới cũng thất bại thì mới bị đưa về lại trang đăng nhập.</w:t>
+      </w:r>
+    </w:p>
+    <w:p>
+      <w:pPr>
+        <w:spacing w:after="180"/>
+        <w:jc w:val="both"/>
+        <w:shd w:val="clear" w:color="auto" w:fill="F3EEFF"/>
+        <w:ind w:left="200" w:right="200"/>
+      </w:pPr>
+      <w:r>
+        <w:rPr>
+          <w:b/>
+          <w:bCs/>
+        </w:rPr>
+        <w:t xml:space="preserve">Điểm nhấn: </w:t>
+      </w:r>
+      <w:r>
+        <w:t xml:space="preserve">cơ chế tự động refresh token chạy ngầm, và nhiều request cùng bị hết hạn phiên một lúc chỉ kích hoạt đúng 1 lần gọi làm mới (dùng chung 1 promise), tránh gọi trùng lặp không cần thiết.</w:t>
+      </w:r>
+    </w:p>
+    <w:p>
+      <w:pPr>
+        <w:spacing w:after="60" w:before="220"/>
+      </w:pPr>
+      <w:r>
+        <w:rPr>
+          <w:b/>
+          <w:bCs/>
+          <w:i/>
+          <w:iCs/>
+          <w:sz w:val="26"/>
+          <w:szCs w:val="26"/>
+        </w:rPr>
+        <w:t xml:space="preserve">Luồng 2 — HR tạo câu hỏi phỏng vấn bằng AI (luồng lõi của hệ thống)</w:t>
+      </w:r>
+    </w:p>
+    <w:p>
+      <w:pPr>
+        <w:spacing w:after="140"/>
+        <w:jc w:val="both"/>
+      </w:pPr>
+      <w:r>
+        <w:t xml:space="preserve">HR nhập vào một bản Job Description. Thay vì sinh câu hỏi ngay, hệ thống chủ động hội thoại làm rõ yêu cầu trước — tối đa 5 lượt trao đổi — để xác định đúng vị trí, cấp độ, và kỹ năng trọng tâm. Khi đã đủ thông tin, hệ thống đề xuất một plan phỏng vấn để HR xem lại và tinh chỉnh qua chat; chỉ khi HR bấm Approve, hệ thống mới thực sự sinh câu hỏi bằng AI.</w:t>
+      </w:r>
+    </w:p>
+    <w:p>
+      <w:pPr>
+        <w:spacing w:after="140"/>
+        <w:jc w:val="both"/>
+      </w:pPr>
+      <w:r>
+        <w:t xml:space="preserve">HR có thể đính kèm tài liệu nội bộ của công ty — quy trình làm việc, tech stack riêng — để AI tham khảo khi ra câu hỏi. Vì bước sinh câu hỏi có thể mất thời gian, hệ thống xử lý nền: HR có thể rời trang, tạo phiên khác, và quay lại xem tiến trình sau — kể cả sau khi tải lại trình duyệt.</w:t>
+      </w:r>
+    </w:p>
+    <w:p>
+      <w:pPr>
+        <w:spacing w:after="180"/>
+        <w:jc w:val="both"/>
+        <w:shd w:val="clear" w:color="auto" w:fill="F3EEFF"/>
+        <w:ind w:left="200" w:right="200"/>
+      </w:pPr>
+      <w:r>
+        <w:rPr>
+          <w:b/>
+          <w:bCs/>
+        </w:rPr>
+        <w:t xml:space="preserve">Điểm nhấn: </w:t>
+      </w:r>
+      <w:r>
+        <w:t xml:space="preserve">đây chính là phần RAG thật — tài liệu công ty được embedding và lưu vào ChromaDB, khi sinh câu hỏi hệ thống tìm kiếm ngữ nghĩa trong kho tài liệu đó để làm ngữ cảnh, nên câu hỏi sát với thực tế công ty chứ không chỉ chung chung theo JD.</w:t>
+      </w:r>
+    </w:p>
+    <w:p>
+      <w:pPr>
+        <w:spacing w:after="60" w:before="220"/>
+      </w:pPr>
+      <w:r>
+        <w:rPr>
+          <w:b/>
+          <w:bCs/>
+          <w:i/>
+          <w:iCs/>
+          <w:sz w:val="26"/>
+          <w:szCs w:val="26"/>
+        </w:rPr>
+        <w:t xml:space="preserve">Luồng 3 — HR quản lý bộ câu hỏi &amp; tìm ứng viên phù hợp</w:t>
+      </w:r>
+    </w:p>
+    <w:p>
+      <w:pPr>
+        <w:spacing w:after="140"/>
+        <w:jc w:val="both"/>
+      </w:pPr>
+      <w:r>
+        <w:t xml:space="preserve">Sau khi có bộ câu hỏi, HR có thể publish công khai lên marketplace để ứng viên tìm thấy, hoặc giữ ở dạng nháp để chỉnh sửa thêm. Song song đó, hệ thống có tính năng gợi ý ứng viên: AI chấm điểm ứng viên đã làm bài theo từng bộ câu hỏi, HR lọc theo điểm số, xem hồ sơ đầy đủ kèm CV, rồi shortlist, loại, hoặc mời phỏng vấn. Ngoài mời trong hệ thống, HR còn gửi được offer trực tiếp qua email.</w:t>
+      </w:r>
+    </w:p>
+    <w:p>
+      <w:pPr>
+        <w:spacing w:after="60" w:before="220"/>
+      </w:pPr>
+      <w:r>
+        <w:rPr>
+          <w:b/>
+          <w:bCs/>
+          <w:i/>
+          <w:iCs/>
+          <w:sz w:val="26"/>
+          <w:szCs w:val="26"/>
+        </w:rPr>
+        <w:t xml:space="preserve">Luồng 4 — Candidate làm bài luyện tập &amp; nhận đánh giá từ AI</w:t>
+      </w:r>
+    </w:p>
+    <w:p>
+      <w:pPr>
+        <w:spacing w:after="140"/>
+        <w:jc w:val="both"/>
+      </w:pPr>
+      <w:r>
+        <w:t xml:space="preserve">Ứng viên bắt đầu hành trình khi nhận lời mời từ HR, hoặc tự chọn một bộ câu hỏi công khai trên marketplace để luyện tập. Sau khi vào bài, họ trả lời lần lượt từng câu hỏi rồi nộp bài. Việc chấm điểm bằng AI chạy nền, nên trang kết quả hiện badge “đang chấm điểm” cho tới khi xong.</w:t>
+      </w:r>
+    </w:p>
+    <w:p>
+      <w:pPr>
+        <w:spacing w:after="140"/>
+        <w:jc w:val="both"/>
+      </w:pPr>
+      <w:r>
+        <w:t xml:space="preserve">Kết quả cuối cùng gồm: điểm từng câu, biểu đồ radar theo từng khía cạnh kỹ năng, và nhận xét tổng thể từ AI. Một số nội dung chi tiết bị giới hạn nếu ứng viên đang dùng gói miễn phí.</w:t>
+      </w:r>
+    </w:p>
+    <w:p>
+      <w:pPr>
+        <w:spacing w:after="60" w:before="220"/>
+      </w:pPr>
+      <w:r>
+        <w:rPr>
+          <w:b/>
+          <w:bCs/>
+          <w:i/>
+          <w:iCs/>
+          <w:sz w:val="26"/>
+          <w:szCs w:val="26"/>
+        </w:rPr>
+        <w:t xml:space="preserve">Luồng 5 — Nâng cấp gói dịch vụ (mô hình kinh doanh)</w:t>
+      </w:r>
+    </w:p>
+    <w:p>
+      <w:pPr>
+        <w:spacing w:after="140"/>
+        <w:jc w:val="both"/>
+      </w:pPr>
+      <w:r>
+        <w:t xml:space="preserve">Hệ thống áp dụng mô hình Freemium cho cả HR và Candidate. Khi người dùng chạm giới hạn — hết lượt tạo câu hỏi trong ngày, hoặc muốn xem đầy đủ đánh giá AI — hệ thống gợi ý nâng cấp ngay tại chỗ. Thanh toán được xử lý qua cổng thanh toán riêng; hệ thống tự động theo dõi trạng thái đơn hàng và cập nhật quyền lợi ngay khi thanh toán thành công, không cần người dùng tự làm mới trang.</w:t>
+      </w:r>
+    </w:p>
+    <w:p>
+      <w:pPr>
+        <w:spacing w:after="60" w:before="220"/>
+      </w:pPr>
+      <w:r>
+        <w:rPr>
+          <w:b/>
+          <w:bCs/>
+          <w:i/>
+          <w:iCs/>
+          <w:sz w:val="26"/>
+          <w:szCs w:val="26"/>
+        </w:rPr>
+        <w:t xml:space="preserve">Luồng 6 — Admin quản trị toàn hệ thống</w:t>
+      </w:r>
+    </w:p>
+    <w:p>
+      <w:pPr>
+        <w:spacing w:after="140"/>
+        <w:jc w:val="both"/>
+      </w:pPr>
+      <w:r>
+        <w:t xml:space="preserve">Admin quản lý tài khoản người dùng và công ty, cấu hình mô hình AI đang sử dụng (chọn nhà cung cấp LLM, điều chỉnh tham số sinh câu hỏi), quản lý giá và giới hạn của các gói dịch vụ, quản lý tài liệu kiến thức dùng chung cho toàn hệ thống, và giám sát marketplace — ghim nổi bật những bộ câu hỏi chất lượng cao.</w:t>
+      </w:r>
+    </w:p>
+    <w:p>
+      <w:pPr>
+        <w:spacing w:after="60" w:before="220"/>
+      </w:pPr>
+      <w:r>
+        <w:rPr>
+          <w:b/>
+          <w:bCs/>
+          <w:i/>
+          <w:iCs/>
+          <w:sz w:val="26"/>
+          <w:szCs w:val="26"/>
+        </w:rPr>
+        <w:t xml:space="preserve">Kết luận</w:t>
+      </w:r>
+    </w:p>
+    <w:p>
+      <w:pPr>
+        <w:spacing w:after="140"/>
+        <w:jc w:val="both"/>
+      </w:pPr>
+      <w:r>
+        <w:t xml:space="preserve">Ba điểm mạnh kỹ thuật cần nhấn lại ở cuối bài: một, RAG thật — câu hỏi sinh ra dựa trên tài liệu và ngữ cảnh cụ thể của từng công ty, không chỉ một prompt chung; hai, quy trình hội thoại làm rõ yêu cầu trước khi sinh, giảm rủi ro AI hiểu sai ý HR; ba, xử lý bất đồng bộ toàn diện — từ sinh câu hỏi, chấm điểm, đến xác nhận thanh toán đều chạy nền, không chặn trải nghiệm người dùng.</w:t>
+      </w:r>
+    </w:p>
+    <w:p>
+      <w:r>
+        <w:br w:type="page"/>
       </w:r>
     </w:p>
     <w:p>

</xml_diff>